<commit_message>
Model Metrics and Project Report Update
</commit_message>
<xml_diff>
--- a/Capstone_2/Project Report.docx
+++ b/Capstone_2/Project Report.docx
@@ -340,7 +340,7 @@
         </w:rPr>
         <w:lastRenderedPageBreak/>
         <w:drawing>
-          <wp:anchor distT="0" distB="0" distL="114300" distR="114300" simplePos="0" relativeHeight="251659264" behindDoc="0" locked="0" layoutInCell="1" allowOverlap="1" wp14:anchorId="6DE1D609" wp14:editId="5CEBB28E">
+          <wp:anchor distT="0" distB="0" distL="114300" distR="114300" simplePos="0" relativeHeight="251659264" behindDoc="0" locked="0" layoutInCell="1" allowOverlap="1" wp14:anchorId="6DE1D609" wp14:editId="2435F72A">
             <wp:simplePos x="0" y="0"/>
             <wp:positionH relativeFrom="column">
               <wp:posOffset>2987040</wp:posOffset>
@@ -400,7 +400,7 @@
           <w:noProof/>
         </w:rPr>
         <w:drawing>
-          <wp:anchor distT="0" distB="0" distL="114300" distR="114300" simplePos="0" relativeHeight="251658240" behindDoc="0" locked="0" layoutInCell="1" allowOverlap="1" wp14:anchorId="6958EE25" wp14:editId="0ABBAD15">
+          <wp:anchor distT="0" distB="0" distL="114300" distR="114300" simplePos="0" relativeHeight="251658240" behindDoc="0" locked="0" layoutInCell="1" allowOverlap="1" wp14:anchorId="6958EE25" wp14:editId="2D189C6E">
             <wp:simplePos x="0" y="0"/>
             <wp:positionH relativeFrom="margin">
               <wp:align>left</wp:align>
@@ -479,7 +479,93 @@
     </w:p>
     <w:p>
       <w:r>
-        <w:t>The data was scaled and dummy variables were created for MPAA rating, and Genre categories. The summary and title columns were also removed from the data.</w:t>
+        <w:t>The data was scaled</w:t>
+      </w:r>
+      <w:r>
+        <w:t xml:space="preserve"> using a standard scaler</w:t>
+      </w:r>
+      <w:r>
+        <w:t xml:space="preserve"> and dummy variables were created for MPAA rating, and Genre categories.</w:t>
+      </w:r>
+      <w:r>
+        <w:t xml:space="preserve"> The </w:t>
+      </w:r>
+      <w:r>
+        <w:t>Release Date</w:t>
+      </w:r>
+      <w:r>
+        <w:t xml:space="preserve"> category was encoded into sine</w:t>
+      </w:r>
+      <w:r>
+        <w:t xml:space="preserve"> and </w:t>
+      </w:r>
+      <w:r>
+        <w:t>cosine feature</w:t>
+      </w:r>
+      <w:r>
+        <w:t>s</w:t>
+      </w:r>
+      <w:r>
+        <w:t xml:space="preserve"> due to </w:t>
+      </w:r>
+      <w:r>
+        <w:t>its</w:t>
+      </w:r>
+      <w:r>
+        <w:t xml:space="preserve"> cyclical nature. Also</w:t>
+      </w:r>
+      <w:r>
+        <w:t>,</w:t>
+      </w:r>
+      <w:r>
+        <w:t xml:space="preserve"> the Gross</w:t>
+      </w:r>
+      <w:r>
+        <w:t xml:space="preserve"> </w:t>
+      </w:r>
+      <w:r>
+        <w:t xml:space="preserve">column was changed to a log scale due to having a skewed distribution. </w:t>
+      </w:r>
+      <w:r>
+        <w:t xml:space="preserve">The </w:t>
+      </w:r>
+      <w:r>
+        <w:t>S</w:t>
+      </w:r>
+      <w:r>
+        <w:t>ummary</w:t>
+      </w:r>
+      <w:r>
+        <w:t>,</w:t>
+      </w:r>
+      <w:r>
+        <w:t xml:space="preserve"> </w:t>
+      </w:r>
+      <w:r>
+        <w:t>T</w:t>
+      </w:r>
+      <w:r>
+        <w:t>itle</w:t>
+      </w:r>
+      <w:r>
+        <w:t xml:space="preserve">, Release </w:t>
+      </w:r>
+      <w:r>
+        <w:t>D</w:t>
+      </w:r>
+      <w:r>
+        <w:t xml:space="preserve">ate, </w:t>
+      </w:r>
+      <w:proofErr w:type="spellStart"/>
+      <w:r>
+        <w:t>genre_Frequency</w:t>
+      </w:r>
+      <w:proofErr w:type="spellEnd"/>
+      <w:r>
+        <w:t>, Net Profit, and ROI</w:t>
+      </w:r>
+      <w:r>
+        <w:t xml:space="preserve"> columns were also removed from the data.</w:t>
       </w:r>
       <w:r>
         <w:t xml:space="preserve"> Then the data was split into training and test sets.</w:t>
@@ -504,32 +590,55 @@
         <w:t>tables show the model metrics and parameters.</w:t>
       </w:r>
     </w:p>
-    <w:p/>
     <w:tbl>
       <w:tblPr>
-        <w:tblStyle w:val="TableGrid"/>
-        <w:tblW w:w="9351" w:type="dxa"/>
+        <w:tblW w:w="7020" w:type="dxa"/>
         <w:tblLook w:val="04A0" w:firstRow="1" w:lastRow="0" w:firstColumn="1" w:lastColumn="0" w:noHBand="0" w:noVBand="1"/>
       </w:tblPr>
       <w:tblGrid>
-        <w:gridCol w:w="2337"/>
-        <w:gridCol w:w="2338"/>
-        <w:gridCol w:w="2338"/>
-        <w:gridCol w:w="2338"/>
+        <w:gridCol w:w="1980"/>
+        <w:gridCol w:w="1314"/>
+        <w:gridCol w:w="1820"/>
+        <w:gridCol w:w="960"/>
+        <w:gridCol w:w="1196"/>
       </w:tblGrid>
       <w:tr>
+        <w:trPr>
+          <w:trHeight w:val="288"/>
+        </w:trPr>
         <w:tc>
           <w:tcPr>
-            <w:tcW w:w="2337" w:type="dxa"/>
+            <w:tcW w:w="1980" w:type="dxa"/>
+            <w:tcBorders>
+              <w:top w:val="nil"/>
+              <w:left w:val="nil"/>
+              <w:bottom w:val="single" w:sz="4" w:space="0" w:color="auto"/>
+              <w:right w:val="single" w:sz="4" w:space="0" w:color="auto"/>
+            </w:tcBorders>
+            <w:noWrap/>
             <w:vAlign w:val="bottom"/>
+            <w:hideMark/>
           </w:tcPr>
           <w:p>
+            <w:pPr>
+              <w:spacing w:after="0" w:line="240" w:lineRule="auto"/>
+              <w:rPr>
+                <w:rFonts w:ascii="Aptos Narrow" w:eastAsia="Times New Roman" w:hAnsi="Aptos Narrow" w:cs="Times New Roman"/>
+                <w:color w:val="000000"/>
+                <w:kern w:val="0"/>
+                <w:sz w:val="22"/>
+                <w:szCs w:val="22"/>
+                <w14:ligatures w14:val="none"/>
+              </w:rPr>
+            </w:pPr>
             <w:r>
               <w:rPr>
-                <w:rFonts w:ascii="Aptos Narrow" w:hAnsi="Aptos Narrow"/>
-                <w:color w:val="000000"/>
-                <w:sz w:val="22"/>
-                <w:szCs w:val="22"/>
+                <w:rFonts w:ascii="Aptos Narrow" w:eastAsia="Times New Roman" w:hAnsi="Aptos Narrow" w:cs="Times New Roman"/>
+                <w:color w:val="000000"/>
+                <w:kern w:val="0"/>
+                <w:sz w:val="22"/>
+                <w:szCs w:val="22"/>
+                <w14:ligatures w14:val="none"/>
               </w:rPr>
               <w:t>Model</w:t>
             </w:r>
@@ -537,16 +646,38 @@
         </w:tc>
         <w:tc>
           <w:tcPr>
-            <w:tcW w:w="2338" w:type="dxa"/>
+            <w:tcW w:w="1064" w:type="dxa"/>
+            <w:tcBorders>
+              <w:top w:val="nil"/>
+              <w:left w:val="single" w:sz="4" w:space="0" w:color="auto"/>
+              <w:bottom w:val="single" w:sz="4" w:space="0" w:color="auto"/>
+              <w:right w:val="single" w:sz="4" w:space="0" w:color="auto"/>
+            </w:tcBorders>
+            <w:noWrap/>
             <w:vAlign w:val="bottom"/>
+            <w:hideMark/>
           </w:tcPr>
           <w:p>
+            <w:pPr>
+              <w:spacing w:after="0" w:line="240" w:lineRule="auto"/>
+              <w:jc w:val="center"/>
+              <w:rPr>
+                <w:rFonts w:ascii="Aptos Narrow" w:eastAsia="Times New Roman" w:hAnsi="Aptos Narrow" w:cs="Times New Roman"/>
+                <w:color w:val="000000"/>
+                <w:kern w:val="0"/>
+                <w:sz w:val="22"/>
+                <w:szCs w:val="22"/>
+                <w14:ligatures w14:val="none"/>
+              </w:rPr>
+            </w:pPr>
             <w:r>
               <w:rPr>
-                <w:rFonts w:ascii="Aptos Narrow" w:hAnsi="Aptos Narrow"/>
-                <w:color w:val="000000"/>
-                <w:sz w:val="22"/>
-                <w:szCs w:val="22"/>
+                <w:rFonts w:ascii="Aptos Narrow" w:eastAsia="Times New Roman" w:hAnsi="Aptos Narrow" w:cs="Times New Roman"/>
+                <w:color w:val="000000"/>
+                <w:kern w:val="0"/>
+                <w:sz w:val="22"/>
+                <w:szCs w:val="22"/>
+                <w14:ligatures w14:val="none"/>
               </w:rPr>
               <w:t>training_R^2</w:t>
             </w:r>
@@ -554,16 +685,38 @@
         </w:tc>
         <w:tc>
           <w:tcPr>
-            <w:tcW w:w="2338" w:type="dxa"/>
+            <w:tcW w:w="1820" w:type="dxa"/>
+            <w:tcBorders>
+              <w:top w:val="nil"/>
+              <w:left w:val="single" w:sz="4" w:space="0" w:color="auto"/>
+              <w:bottom w:val="single" w:sz="4" w:space="0" w:color="auto"/>
+              <w:right w:val="single" w:sz="4" w:space="0" w:color="auto"/>
+            </w:tcBorders>
+            <w:noWrap/>
             <w:vAlign w:val="bottom"/>
+            <w:hideMark/>
           </w:tcPr>
           <w:p>
+            <w:pPr>
+              <w:spacing w:after="0" w:line="240" w:lineRule="auto"/>
+              <w:jc w:val="center"/>
+              <w:rPr>
+                <w:rFonts w:ascii="Aptos Narrow" w:eastAsia="Times New Roman" w:hAnsi="Aptos Narrow" w:cs="Times New Roman"/>
+                <w:color w:val="000000"/>
+                <w:kern w:val="0"/>
+                <w:sz w:val="22"/>
+                <w:szCs w:val="22"/>
+                <w14:ligatures w14:val="none"/>
+              </w:rPr>
+            </w:pPr>
             <w:r>
               <w:rPr>
-                <w:rFonts w:ascii="Aptos Narrow" w:hAnsi="Aptos Narrow"/>
-                <w:color w:val="000000"/>
-                <w:sz w:val="22"/>
-                <w:szCs w:val="22"/>
+                <w:rFonts w:ascii="Aptos Narrow" w:eastAsia="Times New Roman" w:hAnsi="Aptos Narrow" w:cs="Times New Roman"/>
+                <w:color w:val="000000"/>
+                <w:kern w:val="0"/>
+                <w:sz w:val="22"/>
+                <w:szCs w:val="22"/>
+                <w14:ligatures w14:val="none"/>
               </w:rPr>
               <w:t>testing_R^2</w:t>
             </w:r>
@@ -571,541 +724,1028 @@
         </w:tc>
         <w:tc>
           <w:tcPr>
-            <w:tcW w:w="2338" w:type="dxa"/>
+            <w:tcW w:w="960" w:type="dxa"/>
+            <w:tcBorders>
+              <w:top w:val="nil"/>
+              <w:left w:val="single" w:sz="4" w:space="0" w:color="auto"/>
+              <w:bottom w:val="single" w:sz="4" w:space="0" w:color="auto"/>
+              <w:right w:val="single" w:sz="4" w:space="0" w:color="auto"/>
+            </w:tcBorders>
+            <w:noWrap/>
             <w:vAlign w:val="bottom"/>
+            <w:hideMark/>
           </w:tcPr>
           <w:p>
+            <w:pPr>
+              <w:spacing w:after="0" w:line="240" w:lineRule="auto"/>
+              <w:jc w:val="center"/>
+              <w:rPr>
+                <w:rFonts w:ascii="Aptos Narrow" w:eastAsia="Times New Roman" w:hAnsi="Aptos Narrow" w:cs="Times New Roman"/>
+                <w:color w:val="000000"/>
+                <w:kern w:val="0"/>
+                <w:sz w:val="22"/>
+                <w:szCs w:val="22"/>
+                <w14:ligatures w14:val="none"/>
+              </w:rPr>
+            </w:pPr>
             <w:r>
               <w:rPr>
-                <w:rFonts w:ascii="Aptos Narrow" w:hAnsi="Aptos Narrow"/>
-                <w:color w:val="000000"/>
-                <w:sz w:val="22"/>
-                <w:szCs w:val="22"/>
+                <w:rFonts w:ascii="Aptos Narrow" w:eastAsia="Times New Roman" w:hAnsi="Aptos Narrow" w:cs="Times New Roman"/>
+                <w:color w:val="000000"/>
+                <w:kern w:val="0"/>
+                <w:sz w:val="22"/>
+                <w:szCs w:val="22"/>
+                <w14:ligatures w14:val="none"/>
               </w:rPr>
               <w:t>MAE</w:t>
+            </w:r>
+          </w:p>
+        </w:tc>
+        <w:tc>
+          <w:tcPr>
+            <w:tcW w:w="1196" w:type="dxa"/>
+            <w:tcBorders>
+              <w:top w:val="nil"/>
+              <w:left w:val="single" w:sz="4" w:space="0" w:color="auto"/>
+              <w:bottom w:val="single" w:sz="4" w:space="0" w:color="auto"/>
+              <w:right w:val="nil"/>
+            </w:tcBorders>
+            <w:noWrap/>
+            <w:vAlign w:val="bottom"/>
+            <w:hideMark/>
+          </w:tcPr>
+          <w:p>
+            <w:pPr>
+              <w:spacing w:after="0" w:line="240" w:lineRule="auto"/>
+              <w:jc w:val="center"/>
+              <w:rPr>
+                <w:rFonts w:ascii="Aptos Narrow" w:eastAsia="Times New Roman" w:hAnsi="Aptos Narrow" w:cs="Times New Roman"/>
+                <w:color w:val="000000"/>
+                <w:kern w:val="0"/>
+                <w:sz w:val="22"/>
+                <w:szCs w:val="22"/>
+                <w14:ligatures w14:val="none"/>
+              </w:rPr>
+            </w:pPr>
+            <w:r>
+              <w:rPr>
+                <w:rFonts w:ascii="Aptos Narrow" w:eastAsia="Times New Roman" w:hAnsi="Aptos Narrow" w:cs="Times New Roman"/>
+                <w:color w:val="000000"/>
+                <w:kern w:val="0"/>
+                <w:sz w:val="22"/>
+                <w:szCs w:val="22"/>
+                <w14:ligatures w14:val="none"/>
+              </w:rPr>
+              <w:t>K Fold R^2</w:t>
             </w:r>
           </w:p>
         </w:tc>
       </w:tr>
       <w:tr>
+        <w:trPr>
+          <w:trHeight w:val="288"/>
+        </w:trPr>
         <w:tc>
           <w:tcPr>
-            <w:tcW w:w="2337" w:type="dxa"/>
+            <w:tcW w:w="1980" w:type="dxa"/>
+            <w:tcBorders>
+              <w:top w:val="single" w:sz="4" w:space="0" w:color="auto"/>
+              <w:left w:val="nil"/>
+              <w:bottom w:val="single" w:sz="4" w:space="0" w:color="auto"/>
+              <w:right w:val="single" w:sz="4" w:space="0" w:color="auto"/>
+            </w:tcBorders>
+            <w:noWrap/>
             <w:vAlign w:val="bottom"/>
+            <w:hideMark/>
           </w:tcPr>
           <w:p>
+            <w:pPr>
+              <w:spacing w:after="0" w:line="240" w:lineRule="auto"/>
+              <w:rPr>
+                <w:rFonts w:ascii="Aptos Narrow" w:eastAsia="Times New Roman" w:hAnsi="Aptos Narrow" w:cs="Times New Roman"/>
+                <w:color w:val="000000"/>
+                <w:kern w:val="0"/>
+                <w:sz w:val="22"/>
+                <w:szCs w:val="22"/>
+                <w14:ligatures w14:val="none"/>
+              </w:rPr>
+            </w:pPr>
             <w:r>
               <w:rPr>
-                <w:rFonts w:ascii="Aptos Narrow" w:hAnsi="Aptos Narrow"/>
-                <w:color w:val="000000"/>
-                <w:sz w:val="22"/>
-                <w:szCs w:val="22"/>
-              </w:rPr>
-              <w:t>RF Gross, ROI, Net</w:t>
+                <w:rFonts w:ascii="Aptos Narrow" w:eastAsia="Times New Roman" w:hAnsi="Aptos Narrow" w:cs="Times New Roman"/>
+                <w:color w:val="000000"/>
+                <w:kern w:val="0"/>
+                <w:sz w:val="22"/>
+                <w:szCs w:val="22"/>
+                <w14:ligatures w14:val="none"/>
+              </w:rPr>
+              <w:t>Random Forest</w:t>
             </w:r>
           </w:p>
         </w:tc>
         <w:tc>
           <w:tcPr>
-            <w:tcW w:w="2338" w:type="dxa"/>
+            <w:tcW w:w="1064" w:type="dxa"/>
+            <w:tcBorders>
+              <w:top w:val="single" w:sz="4" w:space="0" w:color="auto"/>
+              <w:left w:val="single" w:sz="4" w:space="0" w:color="auto"/>
+              <w:bottom w:val="single" w:sz="4" w:space="0" w:color="auto"/>
+              <w:right w:val="single" w:sz="4" w:space="0" w:color="auto"/>
+            </w:tcBorders>
+            <w:noWrap/>
             <w:vAlign w:val="bottom"/>
+            <w:hideMark/>
           </w:tcPr>
           <w:p>
+            <w:pPr>
+              <w:spacing w:after="0" w:line="240" w:lineRule="auto"/>
+              <w:jc w:val="center"/>
+              <w:rPr>
+                <w:rFonts w:ascii="Aptos Narrow" w:eastAsia="Times New Roman" w:hAnsi="Aptos Narrow" w:cs="Times New Roman"/>
+                <w:color w:val="000000"/>
+                <w:kern w:val="0"/>
+                <w:sz w:val="22"/>
+                <w:szCs w:val="22"/>
+                <w14:ligatures w14:val="none"/>
+              </w:rPr>
+            </w:pPr>
             <w:r>
               <w:rPr>
-                <w:rFonts w:ascii="Aptos Narrow" w:hAnsi="Aptos Narrow"/>
-                <w:color w:val="000000"/>
-                <w:sz w:val="22"/>
-                <w:szCs w:val="22"/>
-              </w:rPr>
-              <w:t>0.9241</w:t>
+                <w:rFonts w:ascii="Aptos Narrow" w:eastAsia="Times New Roman" w:hAnsi="Aptos Narrow" w:cs="Times New Roman"/>
+                <w:color w:val="000000"/>
+                <w:kern w:val="0"/>
+                <w:sz w:val="22"/>
+                <w:szCs w:val="22"/>
+                <w14:ligatures w14:val="none"/>
+              </w:rPr>
+              <w:t>0.9462</w:t>
             </w:r>
           </w:p>
         </w:tc>
         <w:tc>
           <w:tcPr>
-            <w:tcW w:w="2338" w:type="dxa"/>
+            <w:tcW w:w="1820" w:type="dxa"/>
+            <w:tcBorders>
+              <w:top w:val="single" w:sz="4" w:space="0" w:color="auto"/>
+              <w:left w:val="single" w:sz="4" w:space="0" w:color="auto"/>
+              <w:bottom w:val="single" w:sz="4" w:space="0" w:color="auto"/>
+              <w:right w:val="single" w:sz="4" w:space="0" w:color="auto"/>
+            </w:tcBorders>
+            <w:noWrap/>
             <w:vAlign w:val="bottom"/>
+            <w:hideMark/>
           </w:tcPr>
           <w:p>
+            <w:pPr>
+              <w:spacing w:after="0" w:line="240" w:lineRule="auto"/>
+              <w:jc w:val="center"/>
+              <w:rPr>
+                <w:rFonts w:ascii="Aptos Narrow" w:eastAsia="Times New Roman" w:hAnsi="Aptos Narrow" w:cs="Times New Roman"/>
+                <w:color w:val="000000"/>
+                <w:kern w:val="0"/>
+                <w:sz w:val="22"/>
+                <w:szCs w:val="22"/>
+                <w14:ligatures w14:val="none"/>
+              </w:rPr>
+            </w:pPr>
             <w:r>
               <w:rPr>
-                <w:rFonts w:ascii="Aptos Narrow" w:hAnsi="Aptos Narrow"/>
-                <w:color w:val="000000"/>
-                <w:sz w:val="22"/>
-                <w:szCs w:val="22"/>
-              </w:rPr>
-              <w:t>0.4595</w:t>
+                <w:rFonts w:ascii="Aptos Narrow" w:eastAsia="Times New Roman" w:hAnsi="Aptos Narrow" w:cs="Times New Roman"/>
+                <w:color w:val="000000"/>
+                <w:kern w:val="0"/>
+                <w:sz w:val="22"/>
+                <w:szCs w:val="22"/>
+                <w14:ligatures w14:val="none"/>
+              </w:rPr>
+              <w:t>0.5729</w:t>
             </w:r>
           </w:p>
         </w:tc>
         <w:tc>
           <w:tcPr>
-            <w:tcW w:w="2338" w:type="dxa"/>
+            <w:tcW w:w="960" w:type="dxa"/>
+            <w:tcBorders>
+              <w:top w:val="single" w:sz="4" w:space="0" w:color="auto"/>
+              <w:left w:val="single" w:sz="4" w:space="0" w:color="auto"/>
+              <w:bottom w:val="single" w:sz="4" w:space="0" w:color="auto"/>
+              <w:right w:val="single" w:sz="4" w:space="0" w:color="auto"/>
+            </w:tcBorders>
+            <w:noWrap/>
             <w:vAlign w:val="bottom"/>
+            <w:hideMark/>
           </w:tcPr>
           <w:p>
+            <w:pPr>
+              <w:spacing w:after="0" w:line="240" w:lineRule="auto"/>
+              <w:jc w:val="center"/>
+              <w:rPr>
+                <w:rFonts w:ascii="Aptos Narrow" w:eastAsia="Times New Roman" w:hAnsi="Aptos Narrow" w:cs="Times New Roman"/>
+                <w:color w:val="000000"/>
+                <w:kern w:val="0"/>
+                <w:sz w:val="22"/>
+                <w:szCs w:val="22"/>
+                <w14:ligatures w14:val="none"/>
+              </w:rPr>
+            </w:pPr>
             <w:r>
               <w:rPr>
-                <w:rFonts w:ascii="Aptos Narrow" w:hAnsi="Aptos Narrow"/>
-                <w:color w:val="000000"/>
-                <w:sz w:val="22"/>
-                <w:szCs w:val="22"/>
-              </w:rPr>
-              <w:t>70442718.35</w:t>
+                <w:rFonts w:ascii="Aptos Narrow" w:eastAsia="Times New Roman" w:hAnsi="Aptos Narrow" w:cs="Times New Roman"/>
+                <w:color w:val="000000"/>
+                <w:kern w:val="0"/>
+                <w:sz w:val="22"/>
+                <w:szCs w:val="22"/>
+                <w14:ligatures w14:val="none"/>
+              </w:rPr>
+              <w:t>0.3217</w:t>
+            </w:r>
+          </w:p>
+        </w:tc>
+        <w:tc>
+          <w:tcPr>
+            <w:tcW w:w="1196" w:type="dxa"/>
+            <w:tcBorders>
+              <w:top w:val="single" w:sz="4" w:space="0" w:color="auto"/>
+              <w:left w:val="single" w:sz="4" w:space="0" w:color="auto"/>
+              <w:bottom w:val="single" w:sz="4" w:space="0" w:color="auto"/>
+              <w:right w:val="nil"/>
+            </w:tcBorders>
+            <w:noWrap/>
+            <w:vAlign w:val="bottom"/>
+            <w:hideMark/>
+          </w:tcPr>
+          <w:p>
+            <w:pPr>
+              <w:spacing w:after="0" w:line="240" w:lineRule="auto"/>
+              <w:jc w:val="center"/>
+              <w:rPr>
+                <w:rFonts w:ascii="Aptos Narrow" w:eastAsia="Times New Roman" w:hAnsi="Aptos Narrow" w:cs="Times New Roman"/>
+                <w:color w:val="000000"/>
+                <w:kern w:val="0"/>
+                <w:sz w:val="22"/>
+                <w:szCs w:val="22"/>
+                <w14:ligatures w14:val="none"/>
+              </w:rPr>
+            </w:pPr>
+            <w:r>
+              <w:rPr>
+                <w:rFonts w:ascii="Aptos Narrow" w:eastAsia="Times New Roman" w:hAnsi="Aptos Narrow" w:cs="Times New Roman"/>
+                <w:color w:val="000000"/>
+                <w:kern w:val="0"/>
+                <w:sz w:val="22"/>
+                <w:szCs w:val="22"/>
+                <w14:ligatures w14:val="none"/>
+              </w:rPr>
+              <w:t>0.6038</w:t>
             </w:r>
           </w:p>
         </w:tc>
       </w:tr>
       <w:tr>
+        <w:trPr>
+          <w:trHeight w:val="288"/>
+        </w:trPr>
         <w:tc>
           <w:tcPr>
-            <w:tcW w:w="2337" w:type="dxa"/>
+            <w:tcW w:w="1980" w:type="dxa"/>
+            <w:tcBorders>
+              <w:top w:val="single" w:sz="4" w:space="0" w:color="auto"/>
+              <w:left w:val="nil"/>
+              <w:bottom w:val="single" w:sz="4" w:space="0" w:color="auto"/>
+              <w:right w:val="single" w:sz="4" w:space="0" w:color="auto"/>
+            </w:tcBorders>
+            <w:noWrap/>
             <w:vAlign w:val="bottom"/>
+            <w:hideMark/>
           </w:tcPr>
           <w:p>
+            <w:pPr>
+              <w:spacing w:after="0" w:line="240" w:lineRule="auto"/>
+              <w:rPr>
+                <w:rFonts w:ascii="Aptos Narrow" w:eastAsia="Times New Roman" w:hAnsi="Aptos Narrow" w:cs="Times New Roman"/>
+                <w:color w:val="000000"/>
+                <w:kern w:val="0"/>
+                <w:sz w:val="22"/>
+                <w:szCs w:val="22"/>
+                <w14:ligatures w14:val="none"/>
+              </w:rPr>
+            </w:pPr>
+            <w:proofErr w:type="spellStart"/>
             <w:r>
               <w:rPr>
-                <w:rFonts w:ascii="Aptos Narrow" w:hAnsi="Aptos Narrow"/>
-                <w:color w:val="000000"/>
-                <w:sz w:val="22"/>
-                <w:szCs w:val="22"/>
-              </w:rPr>
-              <w:t>RF Gross</w:t>
+                <w:rFonts w:ascii="Aptos Narrow" w:eastAsia="Times New Roman" w:hAnsi="Aptos Narrow" w:cs="Times New Roman"/>
+                <w:color w:val="000000"/>
+                <w:kern w:val="0"/>
+                <w:sz w:val="22"/>
+                <w:szCs w:val="22"/>
+                <w14:ligatures w14:val="none"/>
+              </w:rPr>
+              <w:t>XGBoost</w:t>
+            </w:r>
+            <w:proofErr w:type="spellEnd"/>
+          </w:p>
+        </w:tc>
+        <w:tc>
+          <w:tcPr>
+            <w:tcW w:w="1064" w:type="dxa"/>
+            <w:tcBorders>
+              <w:top w:val="single" w:sz="4" w:space="0" w:color="auto"/>
+              <w:left w:val="single" w:sz="4" w:space="0" w:color="auto"/>
+              <w:bottom w:val="single" w:sz="4" w:space="0" w:color="auto"/>
+              <w:right w:val="single" w:sz="4" w:space="0" w:color="auto"/>
+            </w:tcBorders>
+            <w:noWrap/>
+            <w:vAlign w:val="bottom"/>
+            <w:hideMark/>
+          </w:tcPr>
+          <w:p>
+            <w:pPr>
+              <w:spacing w:after="0" w:line="240" w:lineRule="auto"/>
+              <w:jc w:val="center"/>
+              <w:rPr>
+                <w:rFonts w:ascii="Aptos Narrow" w:eastAsia="Times New Roman" w:hAnsi="Aptos Narrow" w:cs="Times New Roman"/>
+                <w:color w:val="000000"/>
+                <w:kern w:val="0"/>
+                <w:sz w:val="22"/>
+                <w:szCs w:val="22"/>
+                <w14:ligatures w14:val="none"/>
+              </w:rPr>
+            </w:pPr>
+            <w:r>
+              <w:rPr>
+                <w:rFonts w:ascii="Aptos Narrow" w:eastAsia="Times New Roman" w:hAnsi="Aptos Narrow" w:cs="Times New Roman"/>
+                <w:color w:val="000000"/>
+                <w:kern w:val="0"/>
+                <w:sz w:val="22"/>
+                <w:szCs w:val="22"/>
+                <w14:ligatures w14:val="none"/>
+              </w:rPr>
+              <w:t>0.9462</w:t>
             </w:r>
           </w:p>
         </w:tc>
         <w:tc>
           <w:tcPr>
-            <w:tcW w:w="2338" w:type="dxa"/>
+            <w:tcW w:w="1820" w:type="dxa"/>
+            <w:tcBorders>
+              <w:top w:val="single" w:sz="4" w:space="0" w:color="auto"/>
+              <w:left w:val="single" w:sz="4" w:space="0" w:color="auto"/>
+              <w:bottom w:val="single" w:sz="4" w:space="0" w:color="auto"/>
+              <w:right w:val="single" w:sz="4" w:space="0" w:color="auto"/>
+            </w:tcBorders>
+            <w:noWrap/>
             <w:vAlign w:val="bottom"/>
+            <w:hideMark/>
           </w:tcPr>
           <w:p>
+            <w:pPr>
+              <w:spacing w:after="0" w:line="240" w:lineRule="auto"/>
+              <w:jc w:val="center"/>
+              <w:rPr>
+                <w:rFonts w:ascii="Aptos Narrow" w:eastAsia="Times New Roman" w:hAnsi="Aptos Narrow" w:cs="Times New Roman"/>
+                <w:color w:val="000000"/>
+                <w:kern w:val="0"/>
+                <w:sz w:val="22"/>
+                <w:szCs w:val="22"/>
+                <w14:ligatures w14:val="none"/>
+              </w:rPr>
+            </w:pPr>
             <w:r>
               <w:rPr>
-                <w:rFonts w:ascii="Aptos Narrow" w:hAnsi="Aptos Narrow"/>
-                <w:color w:val="000000"/>
-                <w:sz w:val="22"/>
-                <w:szCs w:val="22"/>
-              </w:rPr>
-              <w:t>0.9402</w:t>
+                <w:rFonts w:ascii="Aptos Narrow" w:eastAsia="Times New Roman" w:hAnsi="Aptos Narrow" w:cs="Times New Roman"/>
+                <w:color w:val="000000"/>
+                <w:kern w:val="0"/>
+                <w:sz w:val="22"/>
+                <w:szCs w:val="22"/>
+                <w14:ligatures w14:val="none"/>
+              </w:rPr>
+              <w:t>0.516</w:t>
             </w:r>
           </w:p>
         </w:tc>
         <w:tc>
           <w:tcPr>
-            <w:tcW w:w="2338" w:type="dxa"/>
+            <w:tcW w:w="960" w:type="dxa"/>
+            <w:tcBorders>
+              <w:top w:val="single" w:sz="4" w:space="0" w:color="auto"/>
+              <w:left w:val="single" w:sz="4" w:space="0" w:color="auto"/>
+              <w:bottom w:val="single" w:sz="4" w:space="0" w:color="auto"/>
+              <w:right w:val="single" w:sz="4" w:space="0" w:color="auto"/>
+            </w:tcBorders>
+            <w:noWrap/>
             <w:vAlign w:val="bottom"/>
+            <w:hideMark/>
           </w:tcPr>
           <w:p>
+            <w:pPr>
+              <w:spacing w:after="0" w:line="240" w:lineRule="auto"/>
+              <w:jc w:val="center"/>
+              <w:rPr>
+                <w:rFonts w:ascii="Aptos Narrow" w:eastAsia="Times New Roman" w:hAnsi="Aptos Narrow" w:cs="Times New Roman"/>
+                <w:color w:val="000000"/>
+                <w:kern w:val="0"/>
+                <w:sz w:val="22"/>
+                <w:szCs w:val="22"/>
+                <w14:ligatures w14:val="none"/>
+              </w:rPr>
+            </w:pPr>
             <w:r>
               <w:rPr>
-                <w:rFonts w:ascii="Aptos Narrow" w:hAnsi="Aptos Narrow"/>
-                <w:color w:val="000000"/>
-                <w:sz w:val="22"/>
-                <w:szCs w:val="22"/>
-              </w:rPr>
-              <w:t>0.577</w:t>
+                <w:rFonts w:ascii="Aptos Narrow" w:eastAsia="Times New Roman" w:hAnsi="Aptos Narrow" w:cs="Times New Roman"/>
+                <w:color w:val="000000"/>
+                <w:kern w:val="0"/>
+                <w:sz w:val="22"/>
+                <w:szCs w:val="22"/>
+                <w14:ligatures w14:val="none"/>
+              </w:rPr>
+              <w:t>0.337</w:t>
             </w:r>
           </w:p>
         </w:tc>
         <w:tc>
           <w:tcPr>
-            <w:tcW w:w="2338" w:type="dxa"/>
+            <w:tcW w:w="1196" w:type="dxa"/>
+            <w:tcBorders>
+              <w:top w:val="single" w:sz="4" w:space="0" w:color="auto"/>
+              <w:left w:val="single" w:sz="4" w:space="0" w:color="auto"/>
+              <w:bottom w:val="single" w:sz="4" w:space="0" w:color="auto"/>
+              <w:right w:val="nil"/>
+            </w:tcBorders>
+            <w:noWrap/>
             <w:vAlign w:val="bottom"/>
+            <w:hideMark/>
           </w:tcPr>
           <w:p>
+            <w:pPr>
+              <w:spacing w:after="0" w:line="240" w:lineRule="auto"/>
+              <w:jc w:val="center"/>
+              <w:rPr>
+                <w:rFonts w:ascii="Aptos Narrow" w:eastAsia="Times New Roman" w:hAnsi="Aptos Narrow" w:cs="Times New Roman"/>
+                <w:color w:val="000000"/>
+                <w:kern w:val="0"/>
+                <w:sz w:val="22"/>
+                <w:szCs w:val="22"/>
+                <w14:ligatures w14:val="none"/>
+              </w:rPr>
+            </w:pPr>
             <w:r>
               <w:rPr>
-                <w:rFonts w:ascii="Aptos Narrow" w:hAnsi="Aptos Narrow"/>
-                <w:color w:val="000000"/>
-                <w:sz w:val="22"/>
-                <w:szCs w:val="22"/>
-              </w:rPr>
-              <w:t>109427513.7</w:t>
+                <w:rFonts w:ascii="Aptos Narrow" w:eastAsia="Times New Roman" w:hAnsi="Aptos Narrow" w:cs="Times New Roman"/>
+                <w:color w:val="000000"/>
+                <w:kern w:val="0"/>
+                <w:sz w:val="22"/>
+                <w:szCs w:val="22"/>
+                <w14:ligatures w14:val="none"/>
+              </w:rPr>
+              <w:t>0.5425</w:t>
             </w:r>
           </w:p>
         </w:tc>
       </w:tr>
       <w:tr>
+        <w:trPr>
+          <w:trHeight w:val="288"/>
+        </w:trPr>
         <w:tc>
           <w:tcPr>
-            <w:tcW w:w="2337" w:type="dxa"/>
+            <w:tcW w:w="1980" w:type="dxa"/>
+            <w:tcBorders>
+              <w:top w:val="single" w:sz="4" w:space="0" w:color="auto"/>
+              <w:left w:val="nil"/>
+              <w:bottom w:val="single" w:sz="4" w:space="0" w:color="auto"/>
+              <w:right w:val="single" w:sz="4" w:space="0" w:color="auto"/>
+            </w:tcBorders>
+            <w:noWrap/>
             <w:vAlign w:val="bottom"/>
+            <w:hideMark/>
           </w:tcPr>
           <w:p>
+            <w:pPr>
+              <w:spacing w:after="0" w:line="240" w:lineRule="auto"/>
+              <w:rPr>
+                <w:rFonts w:ascii="Aptos Narrow" w:eastAsia="Times New Roman" w:hAnsi="Aptos Narrow" w:cs="Times New Roman"/>
+                <w:color w:val="000000"/>
+                <w:kern w:val="0"/>
+                <w:sz w:val="22"/>
+                <w:szCs w:val="22"/>
+                <w14:ligatures w14:val="none"/>
+              </w:rPr>
+            </w:pPr>
             <w:r>
               <w:rPr>
-                <w:rFonts w:ascii="Aptos Narrow" w:hAnsi="Aptos Narrow"/>
-                <w:color w:val="000000"/>
-                <w:sz w:val="22"/>
-                <w:szCs w:val="22"/>
-              </w:rPr>
-              <w:t>RF ROI</w:t>
+                <w:rFonts w:ascii="Aptos Narrow" w:eastAsia="Times New Roman" w:hAnsi="Aptos Narrow" w:cs="Times New Roman"/>
+                <w:color w:val="000000"/>
+                <w:kern w:val="0"/>
+                <w:sz w:val="22"/>
+                <w:szCs w:val="22"/>
+                <w14:ligatures w14:val="none"/>
+              </w:rPr>
+              <w:t>Linear Regression</w:t>
             </w:r>
           </w:p>
         </w:tc>
         <w:tc>
           <w:tcPr>
-            <w:tcW w:w="2338" w:type="dxa"/>
+            <w:tcW w:w="1064" w:type="dxa"/>
+            <w:tcBorders>
+              <w:top w:val="single" w:sz="4" w:space="0" w:color="auto"/>
+              <w:left w:val="single" w:sz="4" w:space="0" w:color="auto"/>
+              <w:bottom w:val="single" w:sz="4" w:space="0" w:color="auto"/>
+              <w:right w:val="single" w:sz="4" w:space="0" w:color="auto"/>
+            </w:tcBorders>
+            <w:noWrap/>
             <w:vAlign w:val="bottom"/>
+            <w:hideMark/>
           </w:tcPr>
           <w:p>
+            <w:pPr>
+              <w:spacing w:after="0" w:line="240" w:lineRule="auto"/>
+              <w:jc w:val="center"/>
+              <w:rPr>
+                <w:rFonts w:ascii="Aptos Narrow" w:eastAsia="Times New Roman" w:hAnsi="Aptos Narrow" w:cs="Times New Roman"/>
+                <w:color w:val="000000"/>
+                <w:kern w:val="0"/>
+                <w:sz w:val="22"/>
+                <w:szCs w:val="22"/>
+                <w14:ligatures w14:val="none"/>
+              </w:rPr>
+            </w:pPr>
             <w:r>
               <w:rPr>
-                <w:rFonts w:ascii="Aptos Narrow" w:hAnsi="Aptos Narrow"/>
-                <w:color w:val="000000"/>
-                <w:sz w:val="22"/>
-                <w:szCs w:val="22"/>
-              </w:rPr>
-              <w:t>0.9286</w:t>
+                <w:rFonts w:ascii="Aptos Narrow" w:eastAsia="Times New Roman" w:hAnsi="Aptos Narrow" w:cs="Times New Roman"/>
+                <w:color w:val="000000"/>
+                <w:kern w:val="0"/>
+                <w:sz w:val="22"/>
+                <w:szCs w:val="22"/>
+                <w14:ligatures w14:val="none"/>
+              </w:rPr>
+              <w:t>0.6082</w:t>
             </w:r>
           </w:p>
         </w:tc>
         <w:tc>
           <w:tcPr>
-            <w:tcW w:w="2338" w:type="dxa"/>
+            <w:tcW w:w="1820" w:type="dxa"/>
+            <w:tcBorders>
+              <w:top w:val="single" w:sz="4" w:space="0" w:color="auto"/>
+              <w:left w:val="single" w:sz="4" w:space="0" w:color="auto"/>
+              <w:bottom w:val="single" w:sz="4" w:space="0" w:color="auto"/>
+              <w:right w:val="single" w:sz="4" w:space="0" w:color="auto"/>
+            </w:tcBorders>
+            <w:noWrap/>
             <w:vAlign w:val="bottom"/>
+            <w:hideMark/>
           </w:tcPr>
           <w:p>
+            <w:pPr>
+              <w:spacing w:after="0" w:line="240" w:lineRule="auto"/>
+              <w:jc w:val="center"/>
+              <w:rPr>
+                <w:rFonts w:ascii="Aptos Narrow" w:eastAsia="Times New Roman" w:hAnsi="Aptos Narrow" w:cs="Times New Roman"/>
+                <w:color w:val="000000"/>
+                <w:kern w:val="0"/>
+                <w:sz w:val="22"/>
+                <w:szCs w:val="22"/>
+                <w14:ligatures w14:val="none"/>
+              </w:rPr>
+            </w:pPr>
             <w:r>
               <w:rPr>
-                <w:rFonts w:ascii="Aptos Narrow" w:hAnsi="Aptos Narrow"/>
-                <w:color w:val="000000"/>
-                <w:sz w:val="22"/>
-                <w:szCs w:val="22"/>
-              </w:rPr>
-              <w:t>0.5161</w:t>
+                <w:rFonts w:ascii="Aptos Narrow" w:eastAsia="Times New Roman" w:hAnsi="Aptos Narrow" w:cs="Times New Roman"/>
+                <w:color w:val="000000"/>
+                <w:kern w:val="0"/>
+                <w:sz w:val="22"/>
+                <w:szCs w:val="22"/>
+                <w14:ligatures w14:val="none"/>
+              </w:rPr>
+              <w:t>0.5592</w:t>
             </w:r>
           </w:p>
         </w:tc>
         <w:tc>
           <w:tcPr>
-            <w:tcW w:w="2338" w:type="dxa"/>
+            <w:tcW w:w="960" w:type="dxa"/>
+            <w:tcBorders>
+              <w:top w:val="single" w:sz="4" w:space="0" w:color="auto"/>
+              <w:left w:val="single" w:sz="4" w:space="0" w:color="auto"/>
+              <w:bottom w:val="single" w:sz="4" w:space="0" w:color="auto"/>
+              <w:right w:val="single" w:sz="4" w:space="0" w:color="auto"/>
+            </w:tcBorders>
+            <w:noWrap/>
             <w:vAlign w:val="bottom"/>
+            <w:hideMark/>
           </w:tcPr>
           <w:p>
+            <w:pPr>
+              <w:spacing w:after="0" w:line="240" w:lineRule="auto"/>
+              <w:jc w:val="center"/>
+              <w:rPr>
+                <w:rFonts w:ascii="Aptos Narrow" w:eastAsia="Times New Roman" w:hAnsi="Aptos Narrow" w:cs="Times New Roman"/>
+                <w:color w:val="000000"/>
+                <w:kern w:val="0"/>
+                <w:sz w:val="22"/>
+                <w:szCs w:val="22"/>
+                <w14:ligatures w14:val="none"/>
+              </w:rPr>
+            </w:pPr>
             <w:r>
               <w:rPr>
-                <w:rFonts w:ascii="Aptos Narrow" w:hAnsi="Aptos Narrow"/>
-                <w:color w:val="000000"/>
-                <w:sz w:val="22"/>
-                <w:szCs w:val="22"/>
-              </w:rPr>
-              <w:t>2.4465</w:t>
+                <w:rFonts w:ascii="Aptos Narrow" w:eastAsia="Times New Roman" w:hAnsi="Aptos Narrow" w:cs="Times New Roman"/>
+                <w:color w:val="000000"/>
+                <w:kern w:val="0"/>
+                <w:sz w:val="22"/>
+                <w:szCs w:val="22"/>
+                <w14:ligatures w14:val="none"/>
+              </w:rPr>
+              <w:t>0.3442</w:t>
+            </w:r>
+          </w:p>
+        </w:tc>
+        <w:tc>
+          <w:tcPr>
+            <w:tcW w:w="1196" w:type="dxa"/>
+            <w:tcBorders>
+              <w:top w:val="single" w:sz="4" w:space="0" w:color="auto"/>
+              <w:left w:val="single" w:sz="4" w:space="0" w:color="auto"/>
+              <w:bottom w:val="single" w:sz="4" w:space="0" w:color="auto"/>
+              <w:right w:val="nil"/>
+            </w:tcBorders>
+            <w:noWrap/>
+            <w:vAlign w:val="bottom"/>
+            <w:hideMark/>
+          </w:tcPr>
+          <w:p>
+            <w:pPr>
+              <w:spacing w:after="0" w:line="240" w:lineRule="auto"/>
+              <w:jc w:val="center"/>
+              <w:rPr>
+                <w:rFonts w:ascii="Aptos Narrow" w:eastAsia="Times New Roman" w:hAnsi="Aptos Narrow" w:cs="Times New Roman"/>
+                <w:color w:val="000000"/>
+                <w:kern w:val="0"/>
+                <w:sz w:val="22"/>
+                <w:szCs w:val="22"/>
+                <w14:ligatures w14:val="none"/>
+              </w:rPr>
+            </w:pPr>
+            <w:r>
+              <w:rPr>
+                <w:rFonts w:ascii="Aptos Narrow" w:eastAsia="Times New Roman" w:hAnsi="Aptos Narrow" w:cs="Times New Roman"/>
+                <w:color w:val="000000"/>
+                <w:kern w:val="0"/>
+                <w:sz w:val="22"/>
+                <w:szCs w:val="22"/>
+                <w14:ligatures w14:val="none"/>
+              </w:rPr>
+              <w:t>0.5333</w:t>
             </w:r>
           </w:p>
         </w:tc>
       </w:tr>
       <w:tr>
+        <w:trPr>
+          <w:trHeight w:val="68"/>
+        </w:trPr>
         <w:tc>
           <w:tcPr>
-            <w:tcW w:w="2337" w:type="dxa"/>
+            <w:tcW w:w="1980" w:type="dxa"/>
+            <w:tcBorders>
+              <w:top w:val="single" w:sz="4" w:space="0" w:color="auto"/>
+              <w:left w:val="nil"/>
+              <w:bottom w:val="single" w:sz="4" w:space="0" w:color="auto"/>
+              <w:right w:val="single" w:sz="4" w:space="0" w:color="auto"/>
+            </w:tcBorders>
+            <w:noWrap/>
             <w:vAlign w:val="bottom"/>
+            <w:hideMark/>
           </w:tcPr>
           <w:p>
+            <w:pPr>
+              <w:spacing w:after="0" w:line="240" w:lineRule="auto"/>
+              <w:rPr>
+                <w:rFonts w:ascii="Aptos Narrow" w:eastAsia="Times New Roman" w:hAnsi="Aptos Narrow" w:cs="Times New Roman"/>
+                <w:color w:val="000000"/>
+                <w:kern w:val="0"/>
+                <w:sz w:val="22"/>
+                <w:szCs w:val="22"/>
+                <w14:ligatures w14:val="none"/>
+              </w:rPr>
+            </w:pPr>
             <w:r>
               <w:rPr>
-                <w:rFonts w:ascii="Aptos Narrow" w:hAnsi="Aptos Narrow"/>
-                <w:color w:val="000000"/>
-                <w:sz w:val="22"/>
-                <w:szCs w:val="22"/>
-              </w:rPr>
-              <w:t>RF Net Profit</w:t>
+                <w:rFonts w:ascii="Aptos Narrow" w:eastAsia="Times New Roman" w:hAnsi="Aptos Narrow" w:cs="Times New Roman"/>
+                <w:color w:val="000000"/>
+                <w:kern w:val="0"/>
+                <w:sz w:val="22"/>
+                <w:szCs w:val="22"/>
+                <w14:ligatures w14:val="none"/>
+              </w:rPr>
+              <w:t>SVR</w:t>
             </w:r>
           </w:p>
         </w:tc>
         <w:tc>
           <w:tcPr>
-            <w:tcW w:w="2338" w:type="dxa"/>
+            <w:tcW w:w="1064" w:type="dxa"/>
+            <w:tcBorders>
+              <w:top w:val="single" w:sz="4" w:space="0" w:color="auto"/>
+              <w:left w:val="single" w:sz="4" w:space="0" w:color="auto"/>
+              <w:bottom w:val="single" w:sz="4" w:space="0" w:color="auto"/>
+              <w:right w:val="single" w:sz="4" w:space="0" w:color="auto"/>
+            </w:tcBorders>
+            <w:noWrap/>
             <w:vAlign w:val="bottom"/>
+            <w:hideMark/>
           </w:tcPr>
           <w:p>
+            <w:pPr>
+              <w:spacing w:after="0" w:line="240" w:lineRule="auto"/>
+              <w:jc w:val="center"/>
+              <w:rPr>
+                <w:rFonts w:ascii="Aptos Narrow" w:eastAsia="Times New Roman" w:hAnsi="Aptos Narrow" w:cs="Times New Roman"/>
+                <w:color w:val="000000"/>
+                <w:kern w:val="0"/>
+                <w:sz w:val="22"/>
+                <w:szCs w:val="22"/>
+                <w14:ligatures w14:val="none"/>
+              </w:rPr>
+            </w:pPr>
             <w:r>
               <w:rPr>
-                <w:rFonts w:ascii="Aptos Narrow" w:hAnsi="Aptos Narrow"/>
-                <w:color w:val="000000"/>
-                <w:sz w:val="22"/>
-                <w:szCs w:val="22"/>
-              </w:rPr>
-              <w:t>0.9252</w:t>
+                <w:rFonts w:ascii="Aptos Narrow" w:eastAsia="Times New Roman" w:hAnsi="Aptos Narrow" w:cs="Times New Roman"/>
+                <w:color w:val="000000"/>
+                <w:kern w:val="0"/>
+                <w:sz w:val="22"/>
+                <w:szCs w:val="22"/>
+                <w14:ligatures w14:val="none"/>
+              </w:rPr>
+              <w:t>0.8136</w:t>
             </w:r>
           </w:p>
         </w:tc>
         <w:tc>
           <w:tcPr>
-            <w:tcW w:w="2338" w:type="dxa"/>
+            <w:tcW w:w="1820" w:type="dxa"/>
+            <w:tcBorders>
+              <w:top w:val="single" w:sz="4" w:space="0" w:color="auto"/>
+              <w:left w:val="single" w:sz="4" w:space="0" w:color="auto"/>
+              <w:bottom w:val="single" w:sz="4" w:space="0" w:color="auto"/>
+              <w:right w:val="single" w:sz="4" w:space="0" w:color="auto"/>
+            </w:tcBorders>
+            <w:noWrap/>
             <w:vAlign w:val="bottom"/>
+            <w:hideMark/>
           </w:tcPr>
           <w:p>
+            <w:pPr>
+              <w:spacing w:after="0" w:line="240" w:lineRule="auto"/>
+              <w:jc w:val="center"/>
+              <w:rPr>
+                <w:rFonts w:ascii="Aptos Narrow" w:eastAsia="Times New Roman" w:hAnsi="Aptos Narrow" w:cs="Times New Roman"/>
+                <w:color w:val="000000"/>
+                <w:kern w:val="0"/>
+                <w:sz w:val="22"/>
+                <w:szCs w:val="22"/>
+                <w14:ligatures w14:val="none"/>
+              </w:rPr>
+            </w:pPr>
             <w:r>
               <w:rPr>
-                <w:rFonts w:ascii="Aptos Narrow" w:hAnsi="Aptos Narrow"/>
-                <w:color w:val="000000"/>
-                <w:sz w:val="22"/>
-                <w:szCs w:val="22"/>
-              </w:rPr>
-              <w:t>0.4922</w:t>
+                <w:rFonts w:ascii="Aptos Narrow" w:eastAsia="Times New Roman" w:hAnsi="Aptos Narrow" w:cs="Times New Roman"/>
+                <w:color w:val="000000"/>
+                <w:kern w:val="0"/>
+                <w:sz w:val="22"/>
+                <w:szCs w:val="22"/>
+                <w14:ligatures w14:val="none"/>
+              </w:rPr>
+              <w:t>0.6063</w:t>
             </w:r>
           </w:p>
         </w:tc>
         <w:tc>
           <w:tcPr>
-            <w:tcW w:w="2338" w:type="dxa"/>
+            <w:tcW w:w="960" w:type="dxa"/>
+            <w:tcBorders>
+              <w:top w:val="single" w:sz="4" w:space="0" w:color="auto"/>
+              <w:left w:val="single" w:sz="4" w:space="0" w:color="auto"/>
+              <w:bottom w:val="single" w:sz="4" w:space="0" w:color="auto"/>
+              <w:right w:val="single" w:sz="4" w:space="0" w:color="auto"/>
+            </w:tcBorders>
+            <w:noWrap/>
             <w:vAlign w:val="bottom"/>
+            <w:hideMark/>
           </w:tcPr>
           <w:p>
+            <w:pPr>
+              <w:spacing w:after="0" w:line="240" w:lineRule="auto"/>
+              <w:jc w:val="center"/>
+              <w:rPr>
+                <w:rFonts w:ascii="Aptos Narrow" w:eastAsia="Times New Roman" w:hAnsi="Aptos Narrow" w:cs="Times New Roman"/>
+                <w:color w:val="000000"/>
+                <w:kern w:val="0"/>
+                <w:sz w:val="22"/>
+                <w:szCs w:val="22"/>
+                <w14:ligatures w14:val="none"/>
+              </w:rPr>
+            </w:pPr>
             <w:r>
               <w:rPr>
-                <w:rFonts w:ascii="Aptos Narrow" w:hAnsi="Aptos Narrow"/>
-                <w:color w:val="000000"/>
-                <w:sz w:val="22"/>
-                <w:szCs w:val="22"/>
-              </w:rPr>
-              <w:t>101617691.7</w:t>
+                <w:rFonts w:ascii="Aptos Narrow" w:eastAsia="Times New Roman" w:hAnsi="Aptos Narrow" w:cs="Times New Roman"/>
+                <w:color w:val="000000"/>
+                <w:kern w:val="0"/>
+                <w:sz w:val="22"/>
+                <w:szCs w:val="22"/>
+                <w14:ligatures w14:val="none"/>
+              </w:rPr>
+              <w:t>0.3159</w:t>
+            </w:r>
+          </w:p>
+        </w:tc>
+        <w:tc>
+          <w:tcPr>
+            <w:tcW w:w="1196" w:type="dxa"/>
+            <w:tcBorders>
+              <w:top w:val="single" w:sz="4" w:space="0" w:color="auto"/>
+              <w:left w:val="single" w:sz="4" w:space="0" w:color="auto"/>
+              <w:bottom w:val="single" w:sz="4" w:space="0" w:color="auto"/>
+              <w:right w:val="nil"/>
+            </w:tcBorders>
+            <w:noWrap/>
+            <w:vAlign w:val="bottom"/>
+            <w:hideMark/>
+          </w:tcPr>
+          <w:p>
+            <w:pPr>
+              <w:spacing w:after="0" w:line="240" w:lineRule="auto"/>
+              <w:jc w:val="center"/>
+              <w:rPr>
+                <w:rFonts w:ascii="Aptos Narrow" w:eastAsia="Times New Roman" w:hAnsi="Aptos Narrow" w:cs="Times New Roman"/>
+                <w:color w:val="000000"/>
+                <w:kern w:val="0"/>
+                <w:sz w:val="22"/>
+                <w:szCs w:val="22"/>
+                <w14:ligatures w14:val="none"/>
+              </w:rPr>
+            </w:pPr>
+            <w:r>
+              <w:rPr>
+                <w:rFonts w:ascii="Aptos Narrow" w:eastAsia="Times New Roman" w:hAnsi="Aptos Narrow" w:cs="Times New Roman"/>
+                <w:color w:val="000000"/>
+                <w:kern w:val="0"/>
+                <w:sz w:val="22"/>
+                <w:szCs w:val="22"/>
+                <w14:ligatures w14:val="none"/>
+              </w:rPr>
+              <w:t>0.5837</w:t>
             </w:r>
           </w:p>
         </w:tc>
       </w:tr>
       <w:tr>
+        <w:trPr>
+          <w:trHeight w:val="288"/>
+        </w:trPr>
         <w:tc>
           <w:tcPr>
-            <w:tcW w:w="2337" w:type="dxa"/>
+            <w:tcW w:w="3044" w:type="dxa"/>
+            <w:gridSpan w:val="2"/>
+            <w:tcBorders>
+              <w:top w:val="single" w:sz="4" w:space="0" w:color="auto"/>
+              <w:left w:val="nil"/>
+              <w:bottom w:val="nil"/>
+              <w:right w:val="single" w:sz="4" w:space="0" w:color="auto"/>
+            </w:tcBorders>
+            <w:noWrap/>
             <w:vAlign w:val="bottom"/>
+            <w:hideMark/>
           </w:tcPr>
           <w:p>
+            <w:pPr>
+              <w:spacing w:after="0" w:line="240" w:lineRule="auto"/>
+              <w:rPr>
+                <w:rFonts w:ascii="Aptos Narrow" w:eastAsia="Times New Roman" w:hAnsi="Aptos Narrow" w:cs="Times New Roman"/>
+                <w:color w:val="000000"/>
+                <w:kern w:val="0"/>
+                <w:sz w:val="22"/>
+                <w:szCs w:val="22"/>
+                <w14:ligatures w14:val="none"/>
+              </w:rPr>
+            </w:pPr>
             <w:r>
               <w:rPr>
-                <w:rFonts w:ascii="Aptos Narrow" w:hAnsi="Aptos Narrow"/>
-                <w:color w:val="000000"/>
-                <w:sz w:val="22"/>
-                <w:szCs w:val="22"/>
-              </w:rPr>
-              <w:t>XGBoost Gross</w:t>
+                <w:rFonts w:ascii="Aptos Narrow" w:eastAsia="Times New Roman" w:hAnsi="Aptos Narrow" w:cs="Times New Roman"/>
+                <w:color w:val="000000"/>
+                <w:kern w:val="0"/>
+                <w:sz w:val="22"/>
+                <w:szCs w:val="22"/>
+                <w14:ligatures w14:val="none"/>
+              </w:rPr>
+              <w:t>SVR grid search</w:t>
             </w:r>
           </w:p>
         </w:tc>
         <w:tc>
           <w:tcPr>
-            <w:tcW w:w="2338" w:type="dxa"/>
+            <w:tcW w:w="1820" w:type="dxa"/>
+            <w:tcBorders>
+              <w:top w:val="single" w:sz="4" w:space="0" w:color="auto"/>
+              <w:left w:val="single" w:sz="4" w:space="0" w:color="auto"/>
+              <w:bottom w:val="nil"/>
+              <w:right w:val="single" w:sz="4" w:space="0" w:color="auto"/>
+            </w:tcBorders>
+            <w:noWrap/>
             <w:vAlign w:val="bottom"/>
+            <w:hideMark/>
           </w:tcPr>
           <w:p>
+            <w:pPr>
+              <w:spacing w:after="0" w:line="240" w:lineRule="auto"/>
+              <w:jc w:val="center"/>
+              <w:rPr>
+                <w:rFonts w:ascii="Aptos Narrow" w:eastAsia="Times New Roman" w:hAnsi="Aptos Narrow" w:cs="Times New Roman"/>
+                <w:color w:val="000000"/>
+                <w:kern w:val="0"/>
+                <w:sz w:val="22"/>
+                <w:szCs w:val="22"/>
+                <w14:ligatures w14:val="none"/>
+              </w:rPr>
+            </w:pPr>
             <w:r>
               <w:rPr>
-                <w:rFonts w:ascii="Aptos Narrow" w:hAnsi="Aptos Narrow"/>
-                <w:color w:val="000000"/>
-                <w:sz w:val="22"/>
-                <w:szCs w:val="22"/>
-              </w:rPr>
-              <w:t>0.6336</w:t>
+                <w:rFonts w:ascii="Aptos Narrow" w:eastAsia="Times New Roman" w:hAnsi="Aptos Narrow" w:cs="Times New Roman"/>
+                <w:color w:val="000000"/>
+                <w:kern w:val="0"/>
+                <w:sz w:val="22"/>
+                <w:szCs w:val="22"/>
+                <w14:ligatures w14:val="none"/>
+              </w:rPr>
+              <w:t>0.6321</w:t>
             </w:r>
           </w:p>
         </w:tc>
         <w:tc>
           <w:tcPr>
-            <w:tcW w:w="2338" w:type="dxa"/>
+            <w:tcW w:w="960" w:type="dxa"/>
+            <w:tcBorders>
+              <w:top w:val="single" w:sz="4" w:space="0" w:color="auto"/>
+              <w:left w:val="single" w:sz="4" w:space="0" w:color="auto"/>
+              <w:bottom w:val="nil"/>
+              <w:right w:val="single" w:sz="4" w:space="0" w:color="auto"/>
+            </w:tcBorders>
+            <w:noWrap/>
             <w:vAlign w:val="bottom"/>
+            <w:hideMark/>
           </w:tcPr>
           <w:p>
+            <w:pPr>
+              <w:spacing w:after="0" w:line="240" w:lineRule="auto"/>
+              <w:jc w:val="center"/>
+              <w:rPr>
+                <w:rFonts w:ascii="Aptos Narrow" w:eastAsia="Times New Roman" w:hAnsi="Aptos Narrow" w:cs="Times New Roman"/>
+                <w:color w:val="000000"/>
+                <w:kern w:val="0"/>
+                <w:sz w:val="22"/>
+                <w:szCs w:val="22"/>
+                <w14:ligatures w14:val="none"/>
+              </w:rPr>
+            </w:pPr>
             <w:r>
               <w:rPr>
-                <w:rFonts w:ascii="Aptos Narrow" w:hAnsi="Aptos Narrow"/>
-                <w:color w:val="000000"/>
-                <w:sz w:val="22"/>
-                <w:szCs w:val="22"/>
-              </w:rPr>
-              <w:t>0.5799</w:t>
+                <w:rFonts w:ascii="Aptos Narrow" w:eastAsia="Times New Roman" w:hAnsi="Aptos Narrow" w:cs="Times New Roman"/>
+                <w:color w:val="000000"/>
+                <w:kern w:val="0"/>
+                <w:sz w:val="22"/>
+                <w:szCs w:val="22"/>
+                <w14:ligatures w14:val="none"/>
+              </w:rPr>
+              <w:t>0.4211</w:t>
             </w:r>
           </w:p>
         </w:tc>
         <w:tc>
           <w:tcPr>
-            <w:tcW w:w="2338" w:type="dxa"/>
+            <w:tcW w:w="1196" w:type="dxa"/>
+            <w:tcBorders>
+              <w:top w:val="single" w:sz="4" w:space="0" w:color="auto"/>
+              <w:left w:val="single" w:sz="4" w:space="0" w:color="auto"/>
+              <w:bottom w:val="nil"/>
+              <w:right w:val="nil"/>
+            </w:tcBorders>
+            <w:noWrap/>
             <w:vAlign w:val="bottom"/>
-          </w:tcPr>
-          <w:p>
-            <w:r>
-              <w:rPr>
-                <w:rFonts w:ascii="Aptos Narrow" w:hAnsi="Aptos Narrow"/>
-                <w:color w:val="000000"/>
-                <w:sz w:val="22"/>
-                <w:szCs w:val="22"/>
-              </w:rPr>
-              <w:t>107739359.1</w:t>
-            </w:r>
-          </w:p>
-        </w:tc>
-      </w:tr>
-      <w:tr>
-        <w:tc>
-          <w:tcPr>
-            <w:tcW w:w="2337" w:type="dxa"/>
-            <w:vAlign w:val="bottom"/>
-          </w:tcPr>
-          <w:p>
-            <w:r>
-              <w:rPr>
-                <w:rFonts w:ascii="Aptos Narrow" w:hAnsi="Aptos Narrow"/>
-                <w:color w:val="000000"/>
-                <w:sz w:val="22"/>
-                <w:szCs w:val="22"/>
-              </w:rPr>
-              <w:t>Linear Regression Gross</w:t>
-            </w:r>
-          </w:p>
-        </w:tc>
-        <w:tc>
-          <w:tcPr>
-            <w:tcW w:w="2338" w:type="dxa"/>
-            <w:vAlign w:val="bottom"/>
-          </w:tcPr>
-          <w:p>
-            <w:r>
-              <w:rPr>
-                <w:rFonts w:ascii="Aptos Narrow" w:hAnsi="Aptos Narrow"/>
-                <w:color w:val="000000"/>
-                <w:sz w:val="22"/>
-                <w:szCs w:val="22"/>
-              </w:rPr>
-              <w:t>0.6345</w:t>
-            </w:r>
-          </w:p>
-        </w:tc>
-        <w:tc>
-          <w:tcPr>
-            <w:tcW w:w="2338" w:type="dxa"/>
-            <w:vAlign w:val="bottom"/>
-          </w:tcPr>
-          <w:p>
-            <w:r>
-              <w:rPr>
-                <w:rFonts w:ascii="Aptos Narrow" w:hAnsi="Aptos Narrow"/>
-                <w:color w:val="000000"/>
-                <w:sz w:val="22"/>
-                <w:szCs w:val="22"/>
-              </w:rPr>
-              <w:t>0.6052</w:t>
-            </w:r>
-          </w:p>
-        </w:tc>
-        <w:tc>
-          <w:tcPr>
-            <w:tcW w:w="2338" w:type="dxa"/>
-            <w:vAlign w:val="bottom"/>
-          </w:tcPr>
-          <w:p>
-            <w:r>
-              <w:rPr>
-                <w:rFonts w:ascii="Aptos Narrow" w:hAnsi="Aptos Narrow"/>
-                <w:color w:val="000000"/>
-                <w:sz w:val="22"/>
-                <w:szCs w:val="22"/>
-              </w:rPr>
-              <w:t>106232011.6</w:t>
-            </w:r>
-          </w:p>
-        </w:tc>
-      </w:tr>
-      <w:tr>
-        <w:tc>
-          <w:tcPr>
-            <w:tcW w:w="2337" w:type="dxa"/>
-            <w:vAlign w:val="bottom"/>
+            <w:hideMark/>
           </w:tcPr>
           <w:p>
             <w:pPr>
-              <w:rPr>
-                <w:rFonts w:ascii="Aptos Narrow" w:hAnsi="Aptos Narrow"/>
-                <w:color w:val="000000"/>
-                <w:sz w:val="22"/>
-                <w:szCs w:val="22"/>
+              <w:spacing w:after="0" w:line="240" w:lineRule="auto"/>
+              <w:jc w:val="center"/>
+              <w:rPr>
+                <w:rFonts w:ascii="Aptos Narrow" w:eastAsia="Times New Roman" w:hAnsi="Aptos Narrow" w:cs="Times New Roman"/>
+                <w:color w:val="000000"/>
+                <w:kern w:val="0"/>
+                <w:sz w:val="22"/>
+                <w:szCs w:val="22"/>
+                <w14:ligatures w14:val="none"/>
               </w:rPr>
             </w:pPr>
-            <w:r>
-              <w:rPr>
-                <w:rFonts w:ascii="Aptos Narrow" w:hAnsi="Aptos Narrow"/>
-                <w:color w:val="000000"/>
-                <w:sz w:val="22"/>
-                <w:szCs w:val="22"/>
-              </w:rPr>
-              <w:t>SVR Gross</w:t>
-            </w:r>
-          </w:p>
-        </w:tc>
-        <w:tc>
-          <w:tcPr>
-            <w:tcW w:w="2338" w:type="dxa"/>
-            <w:vAlign w:val="bottom"/>
-          </w:tcPr>
-          <w:p>
-            <w:pPr>
-              <w:rPr>
-                <w:rFonts w:ascii="Aptos Narrow" w:hAnsi="Aptos Narrow"/>
-                <w:color w:val="000000"/>
-                <w:sz w:val="22"/>
-                <w:szCs w:val="22"/>
-              </w:rPr>
-            </w:pPr>
-            <w:r>
-              <w:rPr>
-                <w:rFonts w:ascii="Aptos Narrow" w:hAnsi="Aptos Narrow"/>
-                <w:color w:val="000000"/>
-                <w:sz w:val="22"/>
-                <w:szCs w:val="22"/>
-              </w:rPr>
-              <w:t>-0.0825</w:t>
-            </w:r>
-          </w:p>
-        </w:tc>
-        <w:tc>
-          <w:tcPr>
-            <w:tcW w:w="2338" w:type="dxa"/>
-            <w:vAlign w:val="bottom"/>
-          </w:tcPr>
-          <w:p>
-            <w:pPr>
-              <w:rPr>
-                <w:rFonts w:ascii="Aptos Narrow" w:hAnsi="Aptos Narrow"/>
-                <w:color w:val="000000"/>
-                <w:sz w:val="22"/>
-                <w:szCs w:val="22"/>
-              </w:rPr>
-            </w:pPr>
-            <w:r>
-              <w:rPr>
-                <w:rFonts w:ascii="Aptos Narrow" w:hAnsi="Aptos Narrow"/>
-                <w:color w:val="000000"/>
-                <w:sz w:val="22"/>
-                <w:szCs w:val="22"/>
-              </w:rPr>
-              <w:t>-0.0722</w:t>
-            </w:r>
-          </w:p>
-        </w:tc>
-        <w:tc>
-          <w:tcPr>
-            <w:tcW w:w="2338" w:type="dxa"/>
-            <w:vAlign w:val="bottom"/>
-          </w:tcPr>
-          <w:p>
-            <w:pPr>
-              <w:rPr>
-                <w:rFonts w:ascii="Aptos Narrow" w:hAnsi="Aptos Narrow"/>
-                <w:color w:val="000000"/>
-                <w:sz w:val="22"/>
-                <w:szCs w:val="22"/>
-              </w:rPr>
-            </w:pPr>
-            <w:r>
-              <w:rPr>
-                <w:rFonts w:ascii="Aptos Narrow" w:hAnsi="Aptos Narrow"/>
-                <w:color w:val="000000"/>
-                <w:sz w:val="22"/>
-                <w:szCs w:val="22"/>
-              </w:rPr>
-              <w:t>165470378.2</w:t>
-            </w:r>
           </w:p>
         </w:tc>
       </w:tr>
@@ -1113,37 +1753,66 @@
     <w:p/>
     <w:p>
       <w:r>
-        <w:t xml:space="preserve">There were three predictive features to choose from: ROI, Gross, and Net Profit. Gross Preformed best </w:t>
-      </w:r>
-      <w:r>
-        <w:t>overall with testing data</w:t>
+        <w:t xml:space="preserve">There were three predictive features to choose from: ROI, Gross, and Net Profit. Gross </w:t>
+      </w:r>
+      <w:r>
+        <w:t>performed</w:t>
+      </w:r>
+      <w:r>
+        <w:t xml:space="preserve"> best </w:t>
+      </w:r>
+      <w:r>
+        <w:t xml:space="preserve">overall </w:t>
+      </w:r>
+      <w:r>
+        <w:t>when</w:t>
+      </w:r>
+      <w:r>
+        <w:t xml:space="preserve"> testing data</w:t>
       </w:r>
       <w:r>
         <w:t xml:space="preserve">. </w:t>
       </w:r>
       <w:r>
-        <w:t>Ergo gross was used as the predictive value.</w:t>
-      </w:r>
-    </w:p>
-    <w:p>
-      <w:r>
-        <w:t>Linear Regression out preformed Random Forest, XGBoost and SVR. Linear Regression was chosen for the final model.</w:t>
-      </w:r>
-      <w:r>
-        <w:t xml:space="preserve"> It also has less variability by about 1 million dollars.</w:t>
-      </w:r>
-    </w:p>
-    <w:p>
-      <w:r>
-        <w:rPr>
-          <w:noProof/>
-        </w:rPr>
+        <w:t>Ergo,</w:t>
+      </w:r>
+      <w:r>
+        <w:t xml:space="preserve"> </w:t>
+      </w:r>
+      <w:r>
+        <w:t>the log of G</w:t>
+      </w:r>
+      <w:r>
+        <w:t>ross was used as the predictive value.</w:t>
+      </w:r>
+      <w:r>
+        <w:t xml:space="preserve"> However, I believe that the ROI would be a more useful predictive value, but it could be easily calculated from the final model.</w:t>
+      </w:r>
+    </w:p>
+    <w:p>
+      <w:r>
+        <w:t>Random Forest and SVR performed best. SVR had a lower mean absolute error, so it was chosen as the final model.</w:t>
+      </w:r>
+    </w:p>
+    <w:p>
+      <w:r>
         <w:lastRenderedPageBreak/>
+        <w:t xml:space="preserve">After a grid search, SVR best hyper parameters were found to be the following: C = 1, degree = 2, gamma = auto, </w:t>
+      </w:r>
+      <w:r>
+        <w:t>kernel</w:t>
+      </w:r>
+      <w:r>
+        <w:t xml:space="preserve"> = RBF. These parameters were used for the final SVR model. The metrics table shows that the best hyper parameters increased the R squared value to 0.63, however they also increased the mean absolute error to 0.42.</w:t>
+      </w:r>
+    </w:p>
+    <w:p>
+      <w:r>
         <w:drawing>
-          <wp:inline distT="0" distB="0" distL="0" distR="0" wp14:anchorId="3DF3568D" wp14:editId="2F14151F">
-            <wp:extent cx="5943600" cy="2949575"/>
-            <wp:effectExtent l="0" t="0" r="0" b="3175"/>
-            <wp:docPr id="607691463" name="Picture 1" descr="A graph of a bar graph&#10;&#10;AI-generated content may be incorrect."/>
+          <wp:inline distT="0" distB="0" distL="0" distR="0" wp14:anchorId="4DC0FB63" wp14:editId="5680B25D">
+            <wp:extent cx="5943600" cy="3686810"/>
+            <wp:effectExtent l="0" t="0" r="0" b="8890"/>
+            <wp:docPr id="761999101" name="Picture 1"/>
             <wp:cNvGraphicFramePr>
               <a:graphicFrameLocks xmlns:a="http://schemas.openxmlformats.org/drawingml/2006/main" noChangeAspect="1"/>
             </wp:cNvGraphicFramePr>
@@ -1151,7 +1820,7 @@
               <a:graphicData uri="http://schemas.openxmlformats.org/drawingml/2006/picture">
                 <pic:pic xmlns:pic="http://schemas.openxmlformats.org/drawingml/2006/picture">
                   <pic:nvPicPr>
-                    <pic:cNvPr id="607691463" name="Picture 1" descr="A graph of a bar graph&#10;&#10;AI-generated content may be incorrect."/>
+                    <pic:cNvPr id="761999101" name=""/>
                     <pic:cNvPicPr/>
                   </pic:nvPicPr>
                   <pic:blipFill>
@@ -1163,7 +1832,7 @@
                   <pic:spPr>
                     <a:xfrm>
                       <a:off x="0" y="0"/>
-                      <a:ext cx="5943600" cy="2949575"/>
+                      <a:ext cx="5943600" cy="3686810"/>
                     </a:xfrm>
                     <a:prstGeom prst="rect">
                       <a:avLst/>
@@ -1176,23 +1845,7 @@
         </w:drawing>
       </w:r>
     </w:p>
-    <w:p>
-      <w:r>
-        <w:t xml:space="preserve">The bar graph above shows Feature importance based on the grid search </w:t>
-      </w:r>
-      <w:r>
-        <w:t>best k features</w:t>
-      </w:r>
-      <w:r>
-        <w:t xml:space="preserve">. </w:t>
-      </w:r>
-      <w:r>
-        <w:t>Budget, Rating Count, Runtime and Rating are in the top features. The other features are the MPAA Rating and Genres. The MPAA Rating and Genres should be kept as whole categories because they are dummy variables. Ergo, no features were dropped from the final model other than</w:t>
-      </w:r>
-      <w:r>
-        <w:t xml:space="preserve"> the prediction variables ROI and Net Profit.</w:t>
-      </w:r>
-    </w:p>
+    <w:p/>
     <w:p>
       <w:pPr>
         <w:pStyle w:val="ListParagraph"/>
@@ -1268,26 +1921,24 @@
         <w:t xml:space="preserve"> the </w:t>
       </w:r>
       <w:r>
-        <w:t>MAE</w:t>
+        <w:t>mean absolute error</w:t>
       </w:r>
       <w:r>
         <w:t xml:space="preserve"> for the model was </w:t>
       </w:r>
       <w:r>
-        <w:t>106 million</w:t>
+        <w:t>0.42 based on the log of the Gross</w:t>
       </w:r>
       <w:r>
         <w:t xml:space="preserve">. </w:t>
       </w:r>
       <w:r>
-        <w:t xml:space="preserve">That </w:t>
-      </w:r>
-      <w:r>
-        <w:t>is a very large number if you are making a very small budget movie.</w:t>
-      </w:r>
-    </w:p>
-    <w:p>
-      <w:r>
+        <w:t>That number looks small but represents millions of dollars. A small budget movie would not be predictable with this model.</w:t>
+      </w:r>
+    </w:p>
+    <w:p>
+      <w:r>
+        <w:lastRenderedPageBreak/>
         <w:t xml:space="preserve">I think the most helpful </w:t>
       </w:r>
       <w:r>
@@ -1300,20 +1951,17 @@
         <w:t>how successful a movie could be.</w:t>
       </w:r>
     </w:p>
-    <w:p/>
-    <w:p>
-      <w:pPr>
-        <w:rPr>
-          <w:b/>
-          <w:bCs/>
-        </w:rPr>
-      </w:pPr>
-      <w:r>
-        <w:rPr>
-          <w:b/>
-          <w:bCs/>
-        </w:rPr>
-        <w:t>Future discussion</w:t>
+    <w:p>
+      <w:r>
+        <w:t xml:space="preserve">Future study on this subject should include more robust data of a larger sample size and movie flops as well as blockbuster hits. Future features could also include directors, production companies, production time, cast members </w:t>
+      </w:r>
+      <w:proofErr w:type="spellStart"/>
+      <w:r>
+        <w:t>ect</w:t>
+      </w:r>
+      <w:proofErr w:type="spellEnd"/>
+      <w:r>
+        <w:t>. The list goes on.</w:t>
       </w:r>
     </w:p>
     <w:sectPr>

</xml_diff>